<commit_message>
chore: promote dev snapshot to main
</commit_message>
<xml_diff>
--- a/test_samples/russian_profile_regression.en-ru.docx
+++ b/test_samples/russian_profile_regression.en-ru.docx
@@ -123,6 +123,182 @@
           </w:p>
         </w:tc>
       </w:tr>
+      <w:tr>
+        <w:tc>
+          <w:p>
+            <w:r>
+              <w:t>literary</w:t>
+            </w:r>
+          </w:p>
+        </w:tc>
+        <w:tc>
+          <w:p>
+            <w:r>
+              <w:t>Українська: Вона тихо зачинила двері, і дім знову навчився мовчати.</w:t>
+            </w:r>
+          </w:p>
+        </w:tc>
+      </w:tr>
+      <w:tr>
+        <w:tc>
+          <w:p>
+            <w:r>
+              <w:t>mixed_language</w:t>
+            </w:r>
+          </w:p>
+        </w:tc>
+        <w:tc>
+          <w:p>
+            <w:r>
+              <w:t>Polski: Zażółć gęślą jaźń — próbka polskich znaków.</w:t>
+            </w:r>
+          </w:p>
+        </w:tc>
+      </w:tr>
+      <w:tr>
+        <w:tc>
+          <w:p>
+            <w:r>
+              <w:t>business_legal</w:t>
+            </w:r>
+          </w:p>
+        </w:tc>
+        <w:tc>
+          <w:p>
+            <w:r>
+              <w:t>Nederlands: De klant bevestigde de bestelling en betaalt binnen 14 dagen.</w:t>
+            </w:r>
+          </w:p>
+        </w:tc>
+      </w:tr>
+      <w:tr>
+        <w:tc>
+          <w:p>
+            <w:r>
+              <w:t>scientific</w:t>
+            </w:r>
+          </w:p>
+        </w:tc>
+        <w:tc>
+          <w:p>
+            <w:r>
+              <w:t>Deutsch: Die Ergebnisse deuten auf einen moderaten Zusammenhang hin, aber die Stichprobe ist klein.</w:t>
+            </w:r>
+          </w:p>
+        </w:tc>
+      </w:tr>
+      <w:tr>
+        <w:tc>
+          <w:p>
+            <w:r>
+              <w:t>ordinary_prose</w:t>
+            </w:r>
+          </w:p>
+        </w:tc>
+        <w:tc>
+          <w:p>
+            <w:r>
+              <w:t>Français: Où est l’hôtel? Cela coûte 1 234,56 € aujourd’hui.</w:t>
+            </w:r>
+          </w:p>
+        </w:tc>
+      </w:tr>
+      <w:tr>
+        <w:tc>
+          <w:p>
+            <w:r>
+              <w:t>technical</w:t>
+            </w:r>
+          </w:p>
+        </w:tc>
+        <w:tc>
+          <w:p>
+            <w:r>
+              <w:t>Español: La versión beta mejora la velocidad un 20 %, sin cambiar la API pública.</w:t>
+            </w:r>
+          </w:p>
+        </w:tc>
+      </w:tr>
+      <w:tr>
+        <w:tc>
+          <w:p>
+            <w:r>
+              <w:t>protected_content</w:t>
+            </w:r>
+          </w:p>
+        </w:tc>
+        <w:tc>
+          <w:p>
+            <w:r>
+              <w:t>中文: 请保留变量 ${API_TOKEN}，并将说明翻译成俄语。</w:t>
+            </w:r>
+          </w:p>
+        </w:tc>
+      </w:tr>
+      <w:tr>
+        <w:tc>
+          <w:p>
+            <w:r>
+              <w:t>named_entities</w:t>
+            </w:r>
+          </w:p>
+        </w:tc>
+        <w:tc>
+          <w:p>
+            <w:r>
+              <w:t>日本語: OpenAI Research は新しいモデル ID GPT-5.4 を発表しました。</w:t>
+            </w:r>
+          </w:p>
+        </w:tc>
+      </w:tr>
+      <w:tr>
+        <w:tc>
+          <w:p>
+            <w:r>
+              <w:t>technical</w:t>
+            </w:r>
+          </w:p>
+        </w:tc>
+        <w:tc>
+          <w:p>
+            <w:r>
+              <w:t>한국어: 설정 화면에서 callback URL을 입력하고 저장을 누르세요.</w:t>
+            </w:r>
+          </w:p>
+        </w:tc>
+      </w:tr>
+      <w:tr>
+        <w:tc>
+          <w:p>
+            <w:r>
+              <w:t>ordinary_prose</w:t>
+            </w:r>
+          </w:p>
+        </w:tc>
+        <w:tc>
+          <w:p>
+            <w:r>
+              <w:t>עברית: שלום עולם — זהו טקסט קצר בתוך מסמך מעורב.</w:t>
+            </w:r>
+          </w:p>
+        </w:tc>
+      </w:tr>
+      <w:tr>
+        <w:tc>
+          <w:p>
+            <w:r>
+              <w:t>business_legal</w:t>
+            </w:r>
+          </w:p>
+        </w:tc>
+        <w:tc>
+          <w:p>
+            <w:r>
+              <w:t>العربية: تم توقيع العقد في 5 مايو 2026 ويجب حفظ رقم المستند DOC-77.</w:t>
+            </w:r>
+          </w:p>
+        </w:tc>
+      </w:tr>
     </w:tbl>
   </w:body>
 </w:document>

</xml_diff>